<commit_message>
Auto commit (2026-10-28 15:22) — 2 changes
Claude Code 세션 종료 시 자동 커밋.

Co-Authored-By: Claude <noreply@anthropic.com>
</commit_message>
<xml_diff>
--- a/projects/36_slave_dragon_king/노예라 불린 용의 공주_작가 피드백(10.27 · 1-9화)_10.28.docx
+++ b/projects/36_slave_dragon_king/노예라 불린 용의 공주_작가 피드백(10.27 · 1-9화)_10.28.docx
@@ -248,7 +248,7 @@
           <w:color w:val="1A1A1A"/>
           <w:sz w:val="21"/>
         </w:rPr>
-        <w:t>· 3차(10.27): 그 속마음도 빠졌다. 에드워드가 아이비와 어머니를 잇는 줄이 9화까지 하나도 없다 — 6화 「저 애가 피 흘리는 걸 보니, 가슴이 찢어지는 것 같아!」, 7화 「왜 내 눈은 저 애 하나한테만 가는 거지……」뿐. 아이비를 몰아세우는 줄도 없다(5화 「에드워드와 세바스찬도 싸늘한 얼굴로 아이비를 본다」 지문 하나). 바네사 편에 서 있다가 흔들리는 과정이 화면에 없어서, 10.23에 짚은 "손바닥 뒤집듯"이 9화뿐 아니라 6화부터 그대로다.</w:t>
+        <w:t>· 3차(10.27): 그 속마음도 빠졌다. 에드워드가 아이비를 보고 어머니를 떠올리는 줄이 9화까지 하나도 없다 — 6화 「저 애가 피 흘리는 걸 보니, 가슴이 찢어지는 것 같아!」, 7화 「왜 내 눈은 저 애 하나한테만 가는 거지……」뿐. 남은 건 6화 지문 「엘레노어의 이름에 에드워드 등 세 왕자의 표정이 살짝 굳는다」(아이비가 여왕 이름을 꺼낼 때 셋이 같이 멈칫)와, 어머니 가르침을 바네사 달래는 핑계로 쓰는 6화 대사 「어머니가 늘 말씀하셨지. 왕의 마음은 모든 백성을 품을 만큼 넓어야 한다고」 두 개다. 아이비를 몰아세우는 줄도 없다(5화 「에드워드와 세바스찬도 싸늘한 얼굴로 아이비를 본다」 지문 하나). 바네사 편에 서 있다가 흔들리는 과정이 화면에 없어서, 10.23에 짚은 "손바닥 뒤집듯"이 9화뿐 아니라 6화부터 그대로다.</w:t>
       </w:r>
     </w:p>
     <w:p>
@@ -277,7 +277,7 @@
           <w:color w:val="1A1A1A"/>
           <w:sz w:val="21"/>
         </w:rPr>
-        <w:t>③ 아이비가 자기 일로 맞서는 줄이 빠졌다 (10.22)</w:t>
+        <w:t>③ 아이비가 무릎 명령을 대놓고 거절하는 줄 하나가 빠졌다 (10.22 · 10.27) — 원인 중 제일 작다</w:t>
       </w:r>
     </w:p>
     <w:p>
@@ -307,7 +307,7 @@
           <w:color w:val="1A1A1A"/>
           <w:sz w:val="21"/>
         </w:rPr>
-        <w:t>· 3차: 남을 위해선 맞선다(5화 「왕실이라고 해서 길 한복판에서 죄 없는 사람을 마구 죽여도 되는 특권이 있는 건 아니에요!」). 자기 일엔 해명(5화 「아니에요! 공주님, 전 사람을 구하려던 것뿐이에요」 · 6화 「저는 공주님을 습격하지 않았어요」)과 사과(8화 「죄송해요, 공주님」 · 「전하, 정말 죄송합니다」)뿐. 무릎 꿇으라는 말은 8화 끝에 처음 나온다.</w:t>
+        <w:t>· 3차 아이비도 자기 일로 말로는 맞선다: 2화 사라에게 「하지만 왕성에서 여자는 누구나 갈 수 있다고 발표했는걸요……」(1차엔 없던 대꾸) · 5화 교수대를 들먹이는 마부에게 「내가 안 막았으면 저 애는 깔려 죽었어요! 왕실이라고 해서 길 한복판에서 죄 없는 사람을 마구 죽여도 되는 특권이 있는 건 아니에요!」 · 6화 바네사에게 「축제엔 왕성의 여자라면 누구나 갈 수 있잖아요!」 + 지문 「아이비가 이를 악물고 버둥거리며, 조금도 물러서지 않는다!」 · 6화 「(굽히지 않고) 영웅을 우러르는 마음은 신분으로 정해지는 게 아니에요.」 · 9화 첫 지문 「무릎을 꿇을 기미는 전혀 없다」(말 없는 버팀 · 10.27에 새로 생김). 6화 두 줄은 1차 5화를 그대로 옮긴 것이라, 맞서는 양은 1차와 비슷하거나 조금 많다.</w:t>
       </w:r>
     </w:p>
     <w:p>
@@ -322,7 +322,7 @@
           <w:color w:val="1A1A1A"/>
           <w:sz w:val="21"/>
         </w:rPr>
-        <w:t>· 8화 사과 두 줄과 9화 「깨끗이 치울게요」는 1차 7~8화에도 있었다. 1차와 다른 건 거절 한 줄뿐이다. 10.22엔 5화에 바네사 「지금 당장 무릎 꿇어!」가 남아 있었는데 아이비는 해명만 했고, 10.27엔 그 명령도 빠졌다. 10.27 9화 첫 지문 「무릎을 꿇을 기미는 전혀 없다」는 말 없는 버팀이다.</w:t>
+        <w:t>· 빠진 건 왕실 사람의 명령에 대놓고 "싫다"고 하는 줄 하나다. 10.22엔 5화 바네사 「지금 당장 무릎 꿇어!」가 남아 있었는데 아이비는 해명만 했고, 10.27엔 그 명령까지 빠져 무릎 명령은 8화 끝에 처음 나온다. 8화 사과 두 줄과 9화 「깨끗이 치울게요」는 1차 7~8화에도 있었다.</w:t>
       </w:r>
     </w:p>
     <w:p>
@@ -716,7 +716,7 @@
           <w:color w:val="1A1A1A"/>
           <w:sz w:val="21"/>
         </w:rPr>
-        <w:t>: 지금 원고에는 에드워드가 아이비와 어머니를 잇는 줄이 9화까지 한 줄도 없어요. 6화는 "가슴이 찢어진다", 7화는 "왜 내 눈은 저 애한테만 가지"뿐이라, 18년 아낀 바네사보다 처음 본 노예 편을 드는 이유가 화면에 안 보이고 연애 감정처럼도 읽혀요. 10월 13일에 보내 주신 원고(2.0판) 5화에는 아이비 얼굴이 엘레노어 얼굴과 겹치고, 에드워드가 "어머니……" 하고 중얼거리자 바네사가 "오빠, 방금 뭐라고 했어?" 하고 되묻는 장면이 있었어요. 이 장면을 6화에 줄만 바꿔서 되살려 주세요.</w:t>
+        <w:t>: 지금 원고에는 에드워드가 아이비를 보고 어머니를 떠올리는 줄이 9화까지 한 줄도 없어요(6화 "听到埃莉诺的名字，爱德华等三位王子的神色微怔"은 세 왕자가 여왕 이름에 같이 멈칫하는 지문이에요). 6화는 "가슴이 찢어진다", 7화는 "왜 내 눈은 저 애한테만 가지"뿐이라, 18년 아낀 바네사보다 처음 본 노예 편을 드는 이유가 화면에 안 보이고 연애 감정처럼도 읽혀요. 10월 13일에 보내 주신 원고(2.0판) 5화에는 아이비 얼굴이 엘레노어 얼굴과 겹치고, 에드워드가 "어머니……" 하고 중얼거리자 바네사가 "오빠, 방금 뭐라고 했어?" 하고 되묻는 장면이 있었어요. 이 장면을 6화에 줄만 바꿔서 되살려 주세요.</w:t>
       </w:r>
     </w:p>
     <w:p>
@@ -1191,7 +1191,7 @@
           <w:color w:val="1A1A1A"/>
           <w:sz w:val="22"/>
         </w:rPr>
-        <w:t>[5화 · 005-1] 아이비가 자기를 위해서도 한 번은 맞서게 해 주세요</w:t>
+        <w:t>[5화 · 005-1] 바네사의 무릎 명령을 아이비가 대놓고 거절하는 줄을 되살려 주세요</w:t>
       </w:r>
     </w:p>
     <w:p>
@@ -1306,7 +1306,7 @@
           <w:color w:val="1A1A1A"/>
           <w:sz w:val="21"/>
         </w:rPr>
-        <w:t>: 지금 아이비는 평민 소녀를 위해서는 맞서는데, 자기 일에는 해명과 사과만 해요(5·6화 해명, 8화 "죄송해요, 공주님" · "정말 죄송합니다"). 10월 13일에 보내 주신 원고(2.0판) 4화에는 바네사가 무릎을 꿇으라고 하자 아이비가 "싫습니다! … 공주님께는 저를 억지로 무릎 꿇릴 권리가 없습니다"라고 거절하는 줄이 있었고, 큰길에서 거절한 무릎을 연회에서 결국 억지로 꿇게 돼서 그 장면이 더 아팠어요. 미팅에서 정한 "착하지만 강인한 아이비"에 맞게 이 줄을 되살려 주세요. 아이비가 9화에 결국 꿇는 흐름은 그대로예요.</w:t>
+        <w:t>: 지금 아이비는 말로는 잘 맞서요(5화 마부에게 "如果我不拦住你们……", 6화 "庆典允许王城所有女孩参加！" · "对英雄的敬仰……"). 그런데 왕실 사람이 내린 명령에 대놓고 "싫다"고 하는 줄은 없고, 무릎 명령도 8화 끝에 처음 나와요. 10월 13일에 보내 주신 원고(2.0판) 4화에는 바네사가 무릎을 꿇으라고 하자 아이비가 "싫습니다! … 공주님께는 저를 억지로 무릎 꿇릴 권리가 없습니다"라고 거절하는 줄이 있었고, 큰길에서 거절한 무릎을 연회에서 결국 억지로 꿇게 돼서 그 장면이 더 아팠어요. 미팅에서 정한 "착하지만 강인한 아이비"에 맞게 이 줄을 되살려 주세요. 아이비가 9화에 결국 꿇는 흐름은 그대로예요.</w:t>
       </w:r>
     </w:p>
     <w:p>

</xml_diff>